<commit_message>
fix: align generated Word report pagination
</commit_message>
<xml_diff>
--- a/backend/Report/templates/laporan-performansi-template.docx
+++ b/backend/Report/templates/laporan-performansi-template.docx
@@ -441,7 +441,7 @@
       <w:r>
         <w:fldChar w:fldCharType="separate"/>
       </w:r>
-      <w:hyperlink w:anchor="_Toc238677580" w:history="1">
+      <w:hyperlink w:anchor="_Toc238738758" w:history="1">
         <w:r>
           <w:rPr>
             <w:rStyle w:val="Hyperlink"/>
@@ -468,7 +468,7 @@
             <w:noProof/>
             <w:webHidden/>
           </w:rPr>
-          <w:instrText xml:space="preserve"> PAGEREF _Toc238677580 \h </w:instrText>
+          <w:instrText xml:space="preserve"> PAGEREF _Toc238738758 \h </w:instrText>
         </w:r>
         <w:r>
           <w:rPr>
@@ -513,7 +513,7 @@
           <w14:ligatures w14:val="standardContextual"/>
         </w:rPr>
       </w:pPr>
-      <w:hyperlink w:anchor="_Toc238677581" w:history="1">
+      <w:hyperlink w:anchor="_Toc238738759" w:history="1">
         <w:r>
           <w:rPr>
             <w:rStyle w:val="Hyperlink"/>
@@ -541,7 +541,7 @@
             <w:noProof/>
             <w:webHidden/>
           </w:rPr>
-          <w:instrText xml:space="preserve"> PAGEREF _Toc238677581 \h </w:instrText>
+          <w:instrText xml:space="preserve"> PAGEREF _Toc238738759 \h </w:instrText>
         </w:r>
         <w:r>
           <w:rPr>
@@ -586,7 +586,7 @@
           <w14:ligatures w14:val="standardContextual"/>
         </w:rPr>
       </w:pPr>
-      <w:hyperlink w:anchor="_Toc238677582" w:history="1">
+      <w:hyperlink w:anchor="_Toc238738760" w:history="1">
         <w:r>
           <w:rPr>
             <w:rStyle w:val="Hyperlink"/>
@@ -614,7 +614,7 @@
             <w:noProof/>
             <w:webHidden/>
           </w:rPr>
-          <w:instrText xml:space="preserve"> PAGEREF _Toc238677582 \h </w:instrText>
+          <w:instrText xml:space="preserve"> PAGEREF _Toc238738760 \h </w:instrText>
         </w:r>
         <w:r>
           <w:rPr>
@@ -659,7 +659,7 @@
           <w14:ligatures w14:val="standardContextual"/>
         </w:rPr>
       </w:pPr>
-      <w:hyperlink w:anchor="_Toc238677583" w:history="1">
+      <w:hyperlink w:anchor="_Toc238738761" w:history="1">
         <w:r>
           <w:rPr>
             <w:rStyle w:val="Hyperlink"/>
@@ -687,7 +687,7 @@
             <w:noProof/>
             <w:webHidden/>
           </w:rPr>
-          <w:instrText xml:space="preserve"> PAGEREF _Toc238677583 \h </w:instrText>
+          <w:instrText xml:space="preserve"> PAGEREF _Toc238738761 \h </w:instrText>
         </w:r>
         <w:r>
           <w:rPr>
@@ -732,7 +732,7 @@
           <w14:ligatures w14:val="standardContextual"/>
         </w:rPr>
       </w:pPr>
-      <w:hyperlink w:anchor="_Toc238677584" w:history="1">
+      <w:hyperlink w:anchor="_Toc238738762" w:history="1">
         <w:r>
           <w:rPr>
             <w:rStyle w:val="Hyperlink"/>
@@ -760,7 +760,7 @@
             <w:noProof/>
             <w:webHidden/>
           </w:rPr>
-          <w:instrText xml:space="preserve"> PAGEREF _Toc238677584 \h </w:instrText>
+          <w:instrText xml:space="preserve"> PAGEREF _Toc238738762 \h </w:instrText>
         </w:r>
         <w:r>
           <w:rPr>
@@ -805,7 +805,7 @@
           <w14:ligatures w14:val="standardContextual"/>
         </w:rPr>
       </w:pPr>
-      <w:hyperlink w:anchor="_Toc238677585" w:history="1">
+      <w:hyperlink w:anchor="_Toc238738763" w:history="1">
         <w:r>
           <w:rPr>
             <w:rStyle w:val="Hyperlink"/>
@@ -833,7 +833,7 @@
             <w:noProof/>
             <w:webHidden/>
           </w:rPr>
-          <w:instrText xml:space="preserve"> PAGEREF _Toc238677585 \h </w:instrText>
+          <w:instrText xml:space="preserve"> PAGEREF _Toc238738763 \h </w:instrText>
         </w:r>
         <w:r>
           <w:rPr>
@@ -878,7 +878,7 @@
           <w14:ligatures w14:val="standardContextual"/>
         </w:rPr>
       </w:pPr>
-      <w:hyperlink w:anchor="_Toc238677586" w:history="1">
+      <w:hyperlink w:anchor="_Toc238738764" w:history="1">
         <w:r>
           <w:rPr>
             <w:rStyle w:val="Hyperlink"/>
@@ -906,7 +906,7 @@
             <w:noProof/>
             <w:webHidden/>
           </w:rPr>
-          <w:instrText xml:space="preserve"> PAGEREF _Toc238677586 \h </w:instrText>
+          <w:instrText xml:space="preserve"> PAGEREF _Toc238738764 \h </w:instrText>
         </w:r>
         <w:r>
           <w:rPr>
@@ -926,7 +926,7 @@
             <w:noProof/>
             <w:webHidden/>
           </w:rPr>
-          <w:t>6</w:t>
+          <w:t>7</w:t>
         </w:r>
         <w:r>
           <w:rPr>
@@ -951,14 +951,27 @@
           <w14:ligatures w14:val="standardContextual"/>
         </w:rPr>
       </w:pPr>
-      <w:hyperlink w:anchor="_Toc238677587" w:history="1">
+      <w:hyperlink w:anchor="_Toc238738765" w:history="1">
         <w:r>
           <w:rPr>
             <w:rStyle w:val="Hyperlink"/>
-            <w:bCs/>
-            <w:noProof/>
-          </w:rPr>
-          <w:t>{{report_period}}</w:t>
+            <w:noProof/>
+          </w:rPr>
+          <w:t>{{report_perio</w:t>
+        </w:r>
+        <w:r>
+          <w:rPr>
+            <w:rStyle w:val="Hyperlink"/>
+            <w:noProof/>
+          </w:rPr>
+          <w:t>d</w:t>
+        </w:r>
+        <w:r>
+          <w:rPr>
+            <w:rStyle w:val="Hyperlink"/>
+            <w:noProof/>
+          </w:rPr>
+          <w:t>}}</w:t>
         </w:r>
         <w:r>
           <w:rPr>
@@ -979,7 +992,7 @@
             <w:noProof/>
             <w:webHidden/>
           </w:rPr>
-          <w:instrText xml:space="preserve"> PAGEREF _Toc238677587 \h </w:instrText>
+          <w:instrText xml:space="preserve"> PAGEREF _Toc238738765 \h </w:instrText>
         </w:r>
         <w:r>
           <w:rPr>
@@ -999,7 +1012,7 @@
             <w:noProof/>
             <w:webHidden/>
           </w:rPr>
-          <w:t>6</w:t>
+          <w:t>7</w:t>
         </w:r>
         <w:r>
           <w:rPr>
@@ -1024,7 +1037,7 @@
           <w14:ligatures w14:val="standardContextual"/>
         </w:rPr>
       </w:pPr>
-      <w:hyperlink w:anchor="_Toc238677588" w:history="1">
+      <w:hyperlink w:anchor="_Toc238738766" w:history="1">
         <w:r>
           <w:rPr>
             <w:rStyle w:val="Hyperlink"/>
@@ -1052,7 +1065,7 @@
             <w:noProof/>
             <w:webHidden/>
           </w:rPr>
-          <w:instrText xml:space="preserve"> PAGEREF _Toc238677588 \h </w:instrText>
+          <w:instrText xml:space="preserve"> PAGEREF _Toc238738766 \h </w:instrText>
         </w:r>
         <w:r>
           <w:rPr>
@@ -1072,7 +1085,7 @@
             <w:noProof/>
             <w:webHidden/>
           </w:rPr>
-          <w:t>6</w:t>
+          <w:t>7</w:t>
         </w:r>
         <w:r>
           <w:rPr>
@@ -1097,7 +1110,7 @@
           <w14:ligatures w14:val="standardContextual"/>
         </w:rPr>
       </w:pPr>
-      <w:hyperlink w:anchor="_Toc238677589" w:history="1">
+      <w:hyperlink w:anchor="_Toc238738767" w:history="1">
         <w:r>
           <w:rPr>
             <w:rStyle w:val="Hyperlink"/>
@@ -1125,7 +1138,7 @@
             <w:noProof/>
             <w:webHidden/>
           </w:rPr>
-          <w:instrText xml:space="preserve"> PAGEREF _Toc238677589 \h </w:instrText>
+          <w:instrText xml:space="preserve"> PAGEREF _Toc238738767 \h </w:instrText>
         </w:r>
         <w:r>
           <w:rPr>
@@ -1145,7 +1158,7 @@
             <w:noProof/>
             <w:webHidden/>
           </w:rPr>
-          <w:t>7</w:t>
+          <w:t>8</w:t>
         </w:r>
         <w:r>
           <w:rPr>
@@ -1170,7 +1183,7 @@
           <w14:ligatures w14:val="standardContextual"/>
         </w:rPr>
       </w:pPr>
-      <w:hyperlink w:anchor="_Toc238677590" w:history="1">
+      <w:hyperlink w:anchor="_Toc238738768" w:history="1">
         <w:r>
           <w:rPr>
             <w:rStyle w:val="Hyperlink"/>
@@ -1198,7 +1211,7 @@
             <w:noProof/>
             <w:webHidden/>
           </w:rPr>
-          <w:instrText xml:space="preserve"> PAGEREF _Toc238677590 \h </w:instrText>
+          <w:instrText xml:space="preserve"> PAGEREF _Toc238738768 \h </w:instrText>
         </w:r>
         <w:r>
           <w:rPr>
@@ -1218,7 +1231,7 @@
             <w:noProof/>
             <w:webHidden/>
           </w:rPr>
-          <w:t>8</w:t>
+          <w:t>9</w:t>
         </w:r>
         <w:r>
           <w:rPr>
@@ -1243,7 +1256,7 @@
           <w14:ligatures w14:val="standardContextual"/>
         </w:rPr>
       </w:pPr>
-      <w:hyperlink w:anchor="_Toc238677591" w:history="1">
+      <w:hyperlink w:anchor="_Toc238738769" w:history="1">
         <w:r>
           <w:rPr>
             <w:rStyle w:val="Hyperlink"/>
@@ -1271,7 +1284,7 @@
             <w:noProof/>
             <w:webHidden/>
           </w:rPr>
-          <w:instrText xml:space="preserve"> PAGEREF _Toc238677591 \h </w:instrText>
+          <w:instrText xml:space="preserve"> PAGEREF _Toc238738769 \h </w:instrText>
         </w:r>
         <w:r>
           <w:rPr>
@@ -1291,7 +1304,7 @@
             <w:noProof/>
             <w:webHidden/>
           </w:rPr>
-          <w:t>9</w:t>
+          <w:t>10</w:t>
         </w:r>
         <w:r>
           <w:rPr>
@@ -1314,9 +1327,7 @@
         <w:fldChar w:fldCharType="end"/>
       </w:r>
     </w:p>
-    <w:p>
-      <w:bookmarkStart w:id="0" w:name="_Toc238677580"/>
-    </w:p>
+    <w:p/>
     <w:p>
       <w:pPr>
         <w:pStyle w:val="Heading1"/>
@@ -1325,6 +1336,7 @@
           <w:color w:val="C00000"/>
         </w:rPr>
       </w:pPr>
+      <w:bookmarkStart w:id="0" w:name="_Toc238738758"/>
       <w:r>
         <w:rPr>
           <w:noProof/>
@@ -1468,7 +1480,7 @@
           <w:szCs w:val="48"/>
         </w:rPr>
       </w:pPr>
-      <w:bookmarkStart w:id="1" w:name="_Toc238677581"/>
+      <w:bookmarkStart w:id="1" w:name="_Toc238738759"/>
       <w:r>
         <w:rPr>
           <w:noProof/>
@@ -1525,7 +1537,7 @@
           <w:szCs w:val="24"/>
         </w:rPr>
       </w:pPr>
-      <w:bookmarkStart w:id="2" w:name="_Toc238677582"/>
+      <w:bookmarkStart w:id="2" w:name="_Toc238738760"/>
       <w:r>
         <w:rPr>
           <w:b w:val="0"/>
@@ -1619,7 +1631,7 @@
           <w:szCs w:val="24"/>
         </w:rPr>
       </w:pPr>
-      <w:bookmarkStart w:id="3" w:name="_Toc238677583"/>
+      <w:bookmarkStart w:id="3" w:name="_Toc238738761"/>
       <w:r>
         <w:rPr>
           <w:noProof/>
@@ -1713,7 +1725,7 @@
           <w:szCs w:val="24"/>
         </w:rPr>
       </w:pPr>
-      <w:bookmarkStart w:id="4" w:name="_Toc238677584"/>
+      <w:bookmarkStart w:id="4" w:name="_Toc238738762"/>
       <w:r>
         <w:rPr>
           <w:noProof/>
@@ -1844,7 +1856,7 @@
           <w:szCs w:val="40"/>
         </w:rPr>
       </w:pPr>
-      <w:bookmarkStart w:id="5" w:name="_Toc238677585"/>
+      <w:bookmarkStart w:id="5" w:name="_Toc238738763"/>
       <w:r>
         <w:rPr>
           <w:noProof/>
@@ -1937,14 +1949,55 @@
         <w:t>}}</w:t>
       </w:r>
     </w:p>
-    <w:p>
-      <w:r>
-        <w:br w:type="page"/>
+    <w:p/>
+    <w:p/>
+    <w:p/>
+    <w:p/>
+    <w:p/>
+    <w:p/>
+    <w:p/>
+    <w:p/>
+    <w:p/>
+    <w:p/>
+    <w:p/>
+    <w:p/>
+    <w:p/>
+    <w:p/>
+    <w:p/>
+    <w:p/>
+    <w:p/>
+    <w:p/>
+    <w:p/>
+    <w:p/>
+    <w:p/>
+    <w:p/>
+    <w:p>
+      <w:r>
+        <w:rPr>
+          <w:b/>
+          <w:bCs/>
+          <w:noProof/>
+          <w:color w:val="2F5496" w:themeColor="accent1" w:themeShade="BF"/>
+          <w:sz w:val="40"/>
+          <w:szCs w:val="40"/>
+        </w:rPr>
+        <w:lastRenderedPageBreak/>
+        <w:pict w14:anchorId="122BD09B">
+          <v:rect id="_x0000_s2063" style="position:absolute;margin-left:-34.35pt;margin-top:53.2pt;width:554.4pt;height:734.4pt;z-index:-251644928;visibility:visible;mso-wrap-style:square;mso-wrap-distance-left:9pt;mso-wrap-distance-top:0;mso-wrap-distance-right:9pt;mso-wrap-distance-bottom:0;mso-position-horizontal-relative:text;mso-position-vertical-relative:page;v-text-anchor:top" filled="f" fillcolor="#9bc1ff" strokecolor="#c00000" strokeweight="1.5pt">
+            <v:fill color2="#3f80cd" focus="100%" type="gradient">
+              <o:fill v:ext="view" type="gradientUnscaled"/>
+            </v:fill>
+            <v:shadow color="black" opacity="22938f" offset="0"/>
+            <v:textbox inset=",7.2pt,,7.2pt"/>
+            <w10:wrap anchory="page"/>
+          </v:rect>
+        </w:pict>
       </w:r>
     </w:p>
     <w:p>
       <w:pPr>
         <w:pStyle w:val="Heading1"/>
+        <w:spacing w:after="0"/>
         <w:jc w:val="center"/>
         <w:rPr>
           <w:b w:val="0"/>
@@ -1954,12 +2007,11 @@
           <w:szCs w:val="40"/>
         </w:rPr>
       </w:pPr>
-      <w:bookmarkStart w:id="6" w:name="_Toc238677586"/>
+      <w:bookmarkStart w:id="6" w:name="_Toc238738764"/>
       <w:r>
         <w:rPr>
           <w:noProof/>
         </w:rPr>
-        <w:lastRenderedPageBreak/>
         <w:pict w14:anchorId="122BD09B">
           <v:rect id="_x0000_s2059" style="position:absolute;left:0;text-align:left;margin-left:-33.85pt;margin-top:53.75pt;width:554.4pt;height:734.4pt;z-index:-251649024;visibility:visible;mso-wrap-style:square;mso-wrap-distance-left:9pt;mso-wrap-distance-top:0;mso-wrap-distance-right:9pt;mso-wrap-distance-bottom:0;mso-position-horizontal-relative:text;mso-position-vertical-relative:page;v-text-anchor:top" filled="f" fillcolor="#9bc1ff" strokecolor="#c00000" strokeweight="1.5pt">
             <v:fill color2="#3f80cd" focus="100%" type="gradient">
@@ -1988,43 +2040,35 @@
         <w:pStyle w:val="Heading2"/>
         <w:jc w:val="center"/>
         <w:rPr>
-          <w:b w:val="0"/>
-          <w:bCs/>
           <w:color w:val="2F5496" w:themeColor="accent1" w:themeShade="BF"/>
           <w:sz w:val="40"/>
           <w:szCs w:val="40"/>
         </w:rPr>
       </w:pPr>
-      <w:bookmarkStart w:id="7" w:name="_Toc238677587"/>
-      <w:r>
-        <w:rPr>
-          <w:b w:val="0"/>
-          <w:bCs/>
+      <w:bookmarkStart w:id="7" w:name="_Toc238738765"/>
+      <w:r>
+        <w:rPr>
           <w:color w:val="2F5496" w:themeColor="accent1" w:themeShade="BF"/>
-          <w:sz w:val="40"/>
-          <w:szCs w:val="40"/>
+          <w:sz w:val="48"/>
+          <w:szCs w:val="48"/>
         </w:rPr>
         <w:t>{{</w:t>
       </w:r>
       <w:proofErr w:type="spellStart"/>
       <w:r>
         <w:rPr>
-          <w:b w:val="0"/>
-          <w:bCs/>
           <w:color w:val="2F5496" w:themeColor="accent1" w:themeShade="BF"/>
-          <w:sz w:val="40"/>
-          <w:szCs w:val="40"/>
+          <w:sz w:val="48"/>
+          <w:szCs w:val="48"/>
         </w:rPr>
         <w:t>report_period</w:t>
       </w:r>
       <w:proofErr w:type="spellEnd"/>
       <w:r>
         <w:rPr>
-          <w:b w:val="0"/>
-          <w:bCs/>
           <w:color w:val="2F5496" w:themeColor="accent1" w:themeShade="BF"/>
-          <w:sz w:val="40"/>
-          <w:szCs w:val="40"/>
+          <w:sz w:val="48"/>
+          <w:szCs w:val="48"/>
         </w:rPr>
         <w:t>}}</w:t>
       </w:r>
@@ -2039,7 +2083,7 @@
           <w:color w:val="A5A5A5" w:themeColor="accent3"/>
         </w:rPr>
       </w:pPr>
-      <w:bookmarkStart w:id="8" w:name="_Toc238677588"/>
+      <w:bookmarkStart w:id="8" w:name="_Toc238738766"/>
       <w:r>
         <w:rPr>
           <w:b w:val="0"/>
@@ -2112,7 +2156,7 @@
           <w:color w:val="A5A5A5" w:themeColor="accent3"/>
         </w:rPr>
       </w:pPr>
-      <w:bookmarkStart w:id="9" w:name="_Toc238677589"/>
+      <w:bookmarkStart w:id="9" w:name="_Toc238738767"/>
       <w:r>
         <w:rPr>
           <w:noProof/>
@@ -2185,7 +2229,7 @@
           <w:color w:val="A5A5A5" w:themeColor="accent3"/>
         </w:rPr>
       </w:pPr>
-      <w:bookmarkStart w:id="10" w:name="_Toc238677590"/>
+      <w:bookmarkStart w:id="10" w:name="_Toc238738768"/>
       <w:r>
         <w:rPr>
           <w:b w:val="0"/>
@@ -2265,7 +2309,7 @@
         <w:gridCol w:w="2693"/>
         <w:gridCol w:w="2268"/>
         <w:gridCol w:w="2126"/>
-        <w:gridCol w:w="1276"/>
+        <w:gridCol w:w="1326"/>
         <w:gridCol w:w="1480"/>
       </w:tblGrid>
       <w:tr>
@@ -2278,12 +2322,13 @@
             <w:tcW w:w="2693" w:type="dxa"/>
             <w:shd w:val="clear" w:color="000000" w:fill="C00000"/>
             <w:noWrap/>
-            <w:vAlign w:val="bottom"/>
+            <w:vAlign w:val="center"/>
             <w:hideMark/>
           </w:tcPr>
           <w:p>
             <w:pPr>
               <w:spacing w:after="0"/>
+              <w:jc w:val="center"/>
               <w:rPr>
                 <w:rFonts w:eastAsia="Times New Roman" w:cs="Calibri"/>
                 <w:b/>
@@ -2311,12 +2356,13 @@
             <w:tcW w:w="2268" w:type="dxa"/>
             <w:shd w:val="clear" w:color="000000" w:fill="C00000"/>
             <w:noWrap/>
-            <w:vAlign w:val="bottom"/>
+            <w:vAlign w:val="center"/>
             <w:hideMark/>
           </w:tcPr>
           <w:p>
             <w:pPr>
               <w:spacing w:after="0"/>
+              <w:jc w:val="center"/>
               <w:rPr>
                 <w:rFonts w:eastAsia="Times New Roman" w:cs="Calibri"/>
                 <w:b/>
@@ -2357,12 +2403,13 @@
             <w:tcW w:w="2126" w:type="dxa"/>
             <w:shd w:val="clear" w:color="000000" w:fill="C00000"/>
             <w:noWrap/>
-            <w:vAlign w:val="bottom"/>
+            <w:vAlign w:val="center"/>
             <w:hideMark/>
           </w:tcPr>
           <w:p>
             <w:pPr>
               <w:spacing w:after="0"/>
+              <w:jc w:val="center"/>
               <w:rPr>
                 <w:rFonts w:eastAsia="Times New Roman" w:cs="Calibri"/>
                 <w:b/>
@@ -2416,12 +2463,13 @@
             <w:tcW w:w="1276" w:type="dxa"/>
             <w:shd w:val="clear" w:color="000000" w:fill="C00000"/>
             <w:noWrap/>
-            <w:vAlign w:val="bottom"/>
+            <w:vAlign w:val="center"/>
             <w:hideMark/>
           </w:tcPr>
           <w:p>
             <w:pPr>
-              <w:spacing w:after="0"/>
+              <w:spacing w:after="0" w:line="240" w:lineRule="auto"/>
+              <w:jc w:val="center"/>
               <w:rPr>
                 <w:rFonts w:eastAsia="Times New Roman" w:cs="Calibri"/>
                 <w:b/>
@@ -2431,6 +2479,28 @@
                 <w:szCs w:val="22"/>
               </w:rPr>
             </w:pPr>
+            <w:r>
+              <w:rPr>
+                <w:rFonts w:eastAsia="Times New Roman" w:cs="Calibri"/>
+                <w:b/>
+                <w:bCs/>
+                <w:color w:val="FFFFFF"/>
+                <w:sz w:val="22"/>
+                <w:szCs w:val="22"/>
+              </w:rPr>
+              <w:t>Durasi</w:t>
+            </w:r>
+            <w:r>
+              <w:rPr>
+                <w:rFonts w:eastAsia="Times New Roman" w:cs="Calibri"/>
+                <w:b/>
+                <w:bCs/>
+                <w:color w:val="FFFFFF"/>
+                <w:sz w:val="22"/>
+                <w:szCs w:val="22"/>
+              </w:rPr>
+              <w:t xml:space="preserve"> (</w:t>
+            </w:r>
             <w:proofErr w:type="spellStart"/>
             <w:r>
               <w:rPr>
@@ -2441,9 +2511,20 @@
                 <w:sz w:val="22"/>
                 <w:szCs w:val="22"/>
               </w:rPr>
-              <w:t>Duration</w:t>
+              <w:t>Jam:Menit</w:t>
             </w:r>
             <w:proofErr w:type="spellEnd"/>
+            <w:r>
+              <w:rPr>
+                <w:rFonts w:eastAsia="Times New Roman" w:cs="Calibri"/>
+                <w:b/>
+                <w:bCs/>
+                <w:color w:val="FFFFFF"/>
+                <w:sz w:val="22"/>
+                <w:szCs w:val="22"/>
+              </w:rPr>
+              <w:t>)</w:t>
+            </w:r>
           </w:p>
         </w:tc>
         <w:tc>
@@ -2451,12 +2532,13 @@
             <w:tcW w:w="1480" w:type="dxa"/>
             <w:shd w:val="clear" w:color="000000" w:fill="C00000"/>
             <w:noWrap/>
-            <w:vAlign w:val="bottom"/>
+            <w:vAlign w:val="center"/>
             <w:hideMark/>
           </w:tcPr>
           <w:p>
             <w:pPr>
               <w:spacing w:after="0"/>
+              <w:jc w:val="center"/>
               <w:rPr>
                 <w:rFonts w:eastAsia="Times New Roman" w:cs="Calibri"/>
                 <w:b/>
@@ -2489,12 +2571,13 @@
           <w:tcPr>
             <w:tcW w:w="2693" w:type="dxa"/>
             <w:noWrap/>
-            <w:vAlign w:val="bottom"/>
+            <w:vAlign w:val="center"/>
             <w:hideMark/>
           </w:tcPr>
           <w:p>
             <w:pPr>
               <w:spacing w:after="0"/>
+              <w:jc w:val="center"/>
               <w:rPr>
                 <w:rFonts w:eastAsia="Times New Roman" w:cs="Calibri"/>
                 <w:color w:val="000000"/>
@@ -2508,12 +2591,13 @@
           <w:tcPr>
             <w:tcW w:w="2268" w:type="dxa"/>
             <w:noWrap/>
-            <w:vAlign w:val="bottom"/>
+            <w:vAlign w:val="center"/>
             <w:hideMark/>
           </w:tcPr>
           <w:p>
             <w:pPr>
               <w:spacing w:after="0"/>
+              <w:jc w:val="center"/>
               <w:rPr>
                 <w:rFonts w:eastAsia="Times New Roman" w:cs="Calibri"/>
                 <w:color w:val="000000"/>
@@ -2527,12 +2611,13 @@
           <w:tcPr>
             <w:tcW w:w="2126" w:type="dxa"/>
             <w:noWrap/>
-            <w:vAlign w:val="bottom"/>
+            <w:vAlign w:val="center"/>
             <w:hideMark/>
           </w:tcPr>
           <w:p>
             <w:pPr>
               <w:spacing w:after="0"/>
+              <w:jc w:val="center"/>
               <w:rPr>
                 <w:rFonts w:eastAsia="Times New Roman" w:cs="Calibri"/>
                 <w:color w:val="000000"/>
@@ -2546,12 +2631,13 @@
           <w:tcPr>
             <w:tcW w:w="1276" w:type="dxa"/>
             <w:noWrap/>
-            <w:vAlign w:val="bottom"/>
+            <w:vAlign w:val="center"/>
             <w:hideMark/>
           </w:tcPr>
           <w:p>
             <w:pPr>
               <w:spacing w:after="0"/>
+              <w:jc w:val="center"/>
               <w:rPr>
                 <w:rFonts w:eastAsia="Times New Roman" w:cs="Calibri"/>
                 <w:color w:val="000000"/>
@@ -2565,13 +2651,13 @@
           <w:tcPr>
             <w:tcW w:w="1480" w:type="dxa"/>
             <w:noWrap/>
-            <w:vAlign w:val="bottom"/>
+            <w:vAlign w:val="center"/>
             <w:hideMark/>
           </w:tcPr>
           <w:p>
             <w:pPr>
               <w:spacing w:after="0"/>
-              <w:jc w:val="right"/>
+              <w:jc w:val="center"/>
               <w:rPr>
                 <w:rFonts w:eastAsia="Times New Roman" w:cs="Calibri"/>
                 <w:color w:val="000000"/>
@@ -2608,7 +2694,7 @@
           <w:color w:val="2F5496" w:themeColor="accent1" w:themeShade="BF"/>
         </w:rPr>
       </w:pPr>
-      <w:bookmarkStart w:id="11" w:name="_Toc238677591"/>
+      <w:bookmarkStart w:id="11" w:name="_Toc238738769"/>
       <w:r>
         <w:rPr>
           <w:b w:val="0"/>

</xml_diff>